<commit_message>
Auto commit (2026-10-14 12:18) — 1 changes
Claude Code 세션 종료 시 자동 커밋.

Co-Authored-By: Claude <noreply@anthropic.com>
Claude-Session: https://claude.ai/code/f8cf7277-50d4-44b2-aa90-ae76764cd546
</commit_message>
<xml_diff>
--- a/projects/36_slave_dragon_king/노예라 불린 용의 공주_피칭페이지_v5.docx
+++ b/projects/36_slave_dragon_king/노예라 불린 용의 공주_피칭페이지_v5.docx
@@ -822,7 +822,7 @@
           <w:color w:val="1A1A1A"/>
           <w:sz w:val="22"/>
         </w:rPr>
-        <w:t>남부 용족 첫째 왕자다. 여왕이 죽은 뒤 왕국을 떠받쳤고, 두 동생과 함께 어머니 동상 앞에서 막내 바네사를 영원히 지키겠다고 피로 맹세했다. 바네사가 울며 매달리자 아이비를 붙잡게 한다. "내 동생은 왕국에서 가장 순결한 보석이야. 절대 날 속이지 않아." 아이비에게서 어머니 얼굴을 보고 놓아주지만, 바네사에게는 고작 노예 하나라며 달랜다. 유료에서는 제 손으로 아이비의 흰 날개를 뜯고, 마지막엔 바네사의 불길에서 아이비를 막아서다 자기 날개를 잃는다.</w:t>
+        <w:t>남부 용족 첫째 왕자다. 여왕이 죽은 뒤 왕국을 떠받쳤고, 두 동생과 함께 어머니 동상 앞에서 막내 바네사를 영원히 지키겠다고 피로 맹세했다. 바네사가 울며 매달리자 아이비를 붙잡게 한다. "내 동생은 왕국에서 가장 순결한 보석이야. 절대 날 속이지 않아." 아이비에게서 어머니 얼굴을 보고 놓아주지만, 바네사에게는 고작 노예 하나라며 달랜다. 유료에서는 동생 것을 훔친 날개라고 믿고 제 손으로 아이비의 흰 날개를 뜯고, 진실을 안 뒤엔 바네사의 불길에서 아이비를 막아서다 자기 날개를 잃는다.</w:t>
       </w:r>
     </w:p>
     <w:p>
@@ -852,7 +852,7 @@
           <w:color w:val="1A1A1A"/>
           <w:sz w:val="22"/>
         </w:rPr>
-        <w:t>남부 용족 둘째 왕자다. 바네사에게 어머니의 왕관을 씌워 주고, 연회장에서는 아이비 편을 들려는 웨슬리를 막아선다. "웨슬리 대공! 이건 우리 남부 용족 왕실의 일입니다." 유료에서는 남북 용족 앞에서 자기가 씌워 준 어머니의 왕관을 바네사 머리에서 벗긴다.</w:t>
+        <w:t>남부 용족 둘째 왕자다. 바네사에게 어머니의 왕관을 씌워 주고, 연회장에서는 아이비 편을 들려는 웨슬리를 막아선다. "웨슬리 대공! 이건 우리 남부 용족 왕실의 일입니다." 유료에서는 진실을 안 뒤, 아이비의 누명을 벗기려고 남북 용족 앞에서 자기가 씌워 준 어머니의 왕관을 바네사 머리에서 벗긴다.</w:t>
       </w:r>
     </w:p>
     <w:p>
@@ -882,7 +882,7 @@
           <w:color w:val="1A1A1A"/>
           <w:sz w:val="22"/>
         </w:rPr>
-        <w:t>남부 용족 셋째 왕자다. 바네사에게 "오늘 누구든 널 기분 나쁘게 하면, 내가 지하 감옥에 처넣을 거야."라고 약속하고, 연회장에서 아이비의 오금을 걷어차 무릎 꿇리고 과일 쪽으로 내리누른다. 유료에서는 진실을 안 뒤에도 바네사를 감싸다가, 바네사가 먹인 독에 숨진다.</w:t>
+        <w:t>남부 용족 셋째 왕자다. 바네사에게 "오늘 누구든 널 기분 나쁘게 하면, 내가 지하 감옥에 처넣을 거야."라고 약속하고, 연회장에서 아이비의 오금을 걷어차 무릎 꿇리고 과일 쪽으로 내리누른다. 유료에서는 삼 형제 중 가장 먼저 진실을 알고도 바네사를 동생으로 감싸지만, 반지는 아이비에게 돌려줘야 한다고 했다가 바네사가 먹인 독에 숨진다.</w:t>
       </w:r>
     </w:p>
     <w:p>
@@ -927,7 +927,7 @@
           <w:color w:val="1A1A1A"/>
           <w:sz w:val="22"/>
         </w:rPr>
-        <w:t>바네사의 스무 번째 생일 축제 날은 아이비의 생일이기도 하다. 오빠들은 축제 마지막에 바네사 몸속의 흰 용을 깨우는 혈통 의식을 열 참이다. 축제 내내 오빠들은 바네사 말만 믿고 아이비를 짓밟고, 바네사의 약혼자인 북부 용족 대공 웨슬리만 아이비에게 끌린다. 짓밟힌 아이비 앞에서 반지가 빛난다. 그날 사라에게서 자기가 가짜라는 말을 들은 바네사는, 아이비를 몰래 붙잡아 그 피를 마시고 의식에 선다.</w:t>
+        <w:t>바네사의 스무 번째 생일 축제 날, 같은 날 태어난 아이비도 스무 살이 된다. 오빠들은 축제 마지막에 바네사 몸속의 흰 용을 깨우는 혈통 의식을 열 참이다. 축제 내내 오빠들은 바네사 말만 믿고 아이비를 짓밟고, 바네사의 약혼자인 북부 용족 대공 웨슬리만 아이비에게 끌린다. 짓밟힌 아이비 앞에서 반지가 빛난다. 의식에서 바네사가 가짜인 게 드러날까 봐, 사라는 바네사에게 자기가 친어머니라고 털어놓는다. 바네사는 진짜 공주의 피로 의식을 속이려고, 아이비를 몰래 끌고 가 의식 단상 밑에 묶어 두고 그 피를 마신다.</w:t>
       </w:r>
     </w:p>
     <w:p>
@@ -942,7 +942,7 @@
           <w:color w:val="1A1A1A"/>
           <w:sz w:val="22"/>
         </w:rPr>
-        <w:t>그런데 의식에서 흰 날개가 돋는 쪽은 아이비다. 사라가 갓난 아이비에게 공주의 피를 훔쳐 먹였다고 거짓 자백하자, 에드워드가 제 손으로 그 날개를 뜯는다. 사라진 아이비를 찾아 헤매던 웨슬리가 의식장에 뛰어들어 세 왕자 앞을 막아선다. 에드워드가 막아서면 같이 죽는다고 하자 웨슬리가 답한다. "이 여자를 죽이려면, 나부터 죽여야 할 거다."</w:t>
+        <w:t>그런데 의식에서 정작 단상 밑 아이비에게 흰 날개가 돋는다. 그러자 사라는 친딸 바네사를 지키려고 갓난 아이비에게 공주의 피를 훔쳐 먹였다고 거짓 자백한다. 동생 것을 훔친 날개라고 믿은 에드워드는 제 손으로 그 날개를 뜯는다. 사라진 아이비를 찾아 헤매던 웨슬리가 의식장에 뛰어들어 세 왕자 앞을 막아선다. 에드워드가 막아서면 같이 죽는다고 하자 웨슬리가 답한다. "이 여자를 죽이려면, 나부터 죽여야 할 거다." 웨슬리는 아이비를 안고 의식장을 나간다.</w:t>
       </w:r>
     </w:p>
     <w:p>
@@ -957,7 +957,7 @@
           <w:color w:val="1A1A1A"/>
           <w:sz w:val="22"/>
         </w:rPr>
-        <w:t>오빠들은 흰 용이 된 아이비에게서 자기들 어머니를 보고서야 진실을 알지만 늦었다. 도미닉은 끝까지 바네사를 감싸다 바네사가 먹인 독에 죽는다. 그래도 바네사가 여왕 자리에 오르려 하자, 세바스찬은 남북 용족 앞에서 자기가 씌워 준 왕관을 바네사 머리에서 벗긴다. 몰린 바네사가 흑룡의 힘을 빌려 불길을 뿜자, 에드워드는 아이비 앞을 막아서다 제 날개를 잃는다. 아이비는 바네사가 훔쳐 간 힘을 도로 뜯어내고, 쇠사슬을 채워 용 사육장으로 보낸다. 어머니 엘레노어의 반지를 끼고 여왕이 된 아이비는 무릎 꿇은 에드워드와 세바스찬을 처음으로 "오빠"라고 부르며 일으켜 세운다. 그 자리에 도미닉은 없다. 아이비는 웨슬리와 맺어진다.</w:t>
+        <w:t>그날 밤 바네사와 사라의 말을 엿들은 도미닉이 삼 형제 중 처음으로 진실을 안다. 도미닉은 그래도 바네사에게 넌 여전히 내 동생이라고 하면서도, 반지는 아이비에게 돌려줘야 한다고 말한다. 바네사는 다른 오빠들이 알기 전에 도미닉에게 독을 먹이고, 그 죽음을 아이비에게 뒤집어씌운다. 동생 도미닉을 잃은 에드워드와 세바스찬은 아이비를 쫓고, 숲에 몰린 아이비는 웨슬리 품에서 처음 온전한 흰 용이 된다. 두 오빠는 그 모습에서 어머니 엘레노어를 보고서야 진실을 안다. 바네사가 그래도 여왕 자리에 오르려 하자, 세바스찬은 아이비의 누명을 벗기려고 남북 용족 앞에서 자기가 씌워 준 왕관을 바네사 머리에서 벗긴다. 몰래 흑룡의 힘을 빌려 둔 바네사가 불길을 뿜자, 날개를 뜯었던 에드워드가 이번엔 아이비 앞을 막아서다 제 날개를 잃는다. 아이비는 바네사가 훔쳐 간 힘을 도로 뜯어내고, 쇠사슬을 채워 용 사육장으로 보낸다. 어머니 엘레노어의 반지를 끼고 여왕이 된 아이비는, 날개와 체면을 내놓은 두 오빠를 처음으로 "오빠"라고 부르며 일으켜 세운다. 아이비는 웨슬리와 맺어진다.</w:t>
       </w:r>
     </w:p>
     <w:p>

</xml_diff>

<commit_message>
Auto commit (2026-10-14 12:19) — 3 changes
Claude Code 세션 종료 시 자동 커밋.

Co-Authored-By: Claude <noreply@anthropic.com>
Claude-Session: https://claude.ai/code/f8cf7277-50d4-44b2-aa90-ae76764cd546
</commit_message>
<xml_diff>
--- a/projects/36_slave_dragon_king/노예라 불린 용의 공주_피칭페이지_v5.docx
+++ b/projects/36_slave_dragon_king/노예라 불린 용의 공주_피칭페이지_v5.docx
@@ -822,7 +822,7 @@
           <w:color w:val="1A1A1A"/>
           <w:sz w:val="22"/>
         </w:rPr>
-        <w:t>남부 용족 첫째 왕자다. 여왕이 죽은 뒤 왕국을 떠받쳤고, 두 동생과 함께 어머니 동상 앞에서 막내 바네사를 영원히 지키겠다고 피로 맹세했다. 바네사가 울며 매달리자 아이비를 붙잡게 한다. "내 동생은 왕국에서 가장 순결한 보석이야. 절대 날 속이지 않아." 아이비에게서 어머니 얼굴을 보고 놓아주지만, 바네사에게는 고작 노예 하나라며 달랜다. 유료에서는 동생 것을 훔친 날개라고 믿고 제 손으로 아이비의 흰 날개를 뜯고, 진실을 안 뒤엔 바네사의 불길에서 아이비를 막아서다 자기 날개를 잃는다.</w:t>
+        <w:t>남부 용족 첫째 왕자다. 여왕이 죽은 뒤 왕국을 떠받쳤고, 두 동생과 함께 어머니 동상 앞에서 막내 바네사를 영원히 지키겠다고 피로 맹세했다. 바네사가 울며 매달리자 아이비를 붙잡게 한다. "내 동생은 왕국에서 가장 순결한 보석이야. 절대 날 속이지 않아." 아이비에게서 어머니 얼굴을 보고 놓아주지만, 바네사에게는 고작 노예 하나라며 달랜다. 유료에서는 동생 것을 훔친 날개라고 믿고 제 손으로 아이비의 흰 날개를 뜯고, 진실을 안 뒤엔 바네사의 불길을 아이비 대신 맞아 자기 날개를 잃는다.</w:t>
       </w:r>
     </w:p>
     <w:p>
@@ -957,7 +957,7 @@
           <w:color w:val="1A1A1A"/>
           <w:sz w:val="22"/>
         </w:rPr>
-        <w:t>그날 밤 바네사와 사라의 말을 엿들은 도미닉이 삼 형제 중 처음으로 진실을 안다. 도미닉은 그래도 바네사에게 넌 여전히 내 동생이라고 하면서도, 반지는 아이비에게 돌려줘야 한다고 말한다. 바네사는 다른 오빠들이 알기 전에 도미닉에게 독을 먹이고, 그 죽음을 아이비에게 뒤집어씌운다. 동생 도미닉을 잃은 에드워드와 세바스찬은 아이비를 쫓고, 숲에 몰린 아이비는 웨슬리 품에서 처음 온전한 흰 용이 된다. 두 오빠는 그 모습에서 어머니 엘레노어를 보고서야 진실을 안다. 바네사가 그래도 여왕 자리에 오르려 하자, 세바스찬은 아이비의 누명을 벗기려고 남북 용족 앞에서 자기가 씌워 준 왕관을 바네사 머리에서 벗긴다. 몰래 흑룡의 힘을 빌려 둔 바네사가 불길을 뿜자, 날개를 뜯었던 에드워드가 이번엔 아이비 앞을 막아서다 제 날개를 잃는다. 아이비는 바네사가 훔쳐 간 힘을 도로 뜯어내고, 쇠사슬을 채워 용 사육장으로 보낸다. 어머니 엘레노어의 반지를 끼고 여왕이 된 아이비는, 날개와 체면을 내놓은 두 오빠를 처음으로 "오빠"라고 부르며 일으켜 세운다. 아이비는 웨슬리와 맺어진다.</w:t>
+        <w:t>그날 밤 바네사와 사라의 말을 엿들은 도미닉이 삼 형제 중 처음으로 진실을 안다. 도미닉은 그래도 바네사에게 넌 여전히 내 동생이라고 하면서도, 반지는 아이비에게 돌려줘야 한다고 말한다. 바네사는 다른 오빠들이 알기 전에 도미닉에게 독을 먹이고, 그 죽음을 아이비에게 뒤집어씌운다. 동생 도미닉을 잃은 에드워드와 세바스찬은 아이비를 쫓고, 숲에 몰린 아이비는 웨슬리 품에서 처음 온전한 흰 용이 된다. 두 오빠는 그 모습에서 어머니 엘레노어를 보고서야 진실을 안다. 바네사가 그래도 여왕 자리에 오르려 하자, 세바스찬은 아이비의 누명을 벗기려고 남북 용족 앞에서 자기가 씌워 준 왕관을 바네사 머리에서 벗긴다. 몰래 흑룡의 힘을 빌려 둔 바네사가 불길을 뿜자, 날개를 뜯었던 에드워드가 이번엔 그 불길을 아이비 대신 맞아 제 날개를 잃는다. 아이비는 바네사가 훔쳐 간 힘을 도로 뜯어내고, 쇠사슬을 채워 용 사육장으로 보낸다. 어머니 엘레노어의 반지를 끼고 여왕이 된 아이비는, 날개와 체면을 내놓은 두 오빠를 처음으로 "오빠"라고 부르며 일으켜 세운다. 아이비는 웨슬리와 맺어진다.</w:t>
       </w:r>
     </w:p>
     <w:p>

</xml_diff>

<commit_message>
Auto commit (2026-10-14 12:20) — 3 changes
Claude Code 세션 종료 시 자동 커밋.

Co-Authored-By: Claude <noreply@anthropic.com>
</commit_message>
<xml_diff>
--- a/projects/36_slave_dragon_king/노예라 불린 용의 공주_피칭페이지_v5.docx
+++ b/projects/36_slave_dragon_king/노예라 불린 용의 공주_피칭페이지_v5.docx
@@ -822,7 +822,7 @@
           <w:color w:val="1A1A1A"/>
           <w:sz w:val="22"/>
         </w:rPr>
-        <w:t>남부 용족 첫째 왕자다. 여왕이 죽은 뒤 왕국을 떠받쳤고, 두 동생과 함께 어머니 동상 앞에서 막내 바네사를 영원히 지키겠다고 피로 맹세했다. 바네사가 울며 매달리자 아이비를 붙잡게 한다. "내 동생은 왕국에서 가장 순결한 보석이야. 절대 날 속이지 않아." 아이비에게서 어머니 얼굴을 보고 놓아주지만, 바네사에게는 고작 노예 하나라며 달랜다. 유료에서는 동생 것을 훔친 날개라고 믿고 제 손으로 아이비의 흰 날개를 뜯고, 진실을 안 뒤엔 바네사의 불길을 아이비 대신 맞아 자기 날개를 잃는다.</w:t>
+        <w:t>남부 용족 첫째 왕자다. 여왕이 죽은 뒤 왕국을 떠받쳤고, 두 동생과 함께 어머니 동상 앞에서 막내 바네사를 영원히 지키겠다고 피로 맹세했다. 바네사가 울며 매달리자 아이비를 붙잡게 한다. "내 동생은 왕국에서 가장 순결한 보석이야. 절대 날 속이지 않아." 아이비에게서 어머니 얼굴을 보고 놓아주지만, 바네사에게는 고작 노예 하나라며 달랜다. 유료에서는 동생 것을 훔친 날개라고 믿고 제 손으로 아이비의 흰 날개를 뜯고, 바네사가 도미닉까지 죽인 걸 안 뒤엔 바네사의 불길을 아이비 대신 맞아 자기 날개를 잃는다.</w:t>
       </w:r>
     </w:p>
     <w:p>
@@ -852,7 +852,7 @@
           <w:color w:val="1A1A1A"/>
           <w:sz w:val="22"/>
         </w:rPr>
-        <w:t>남부 용족 둘째 왕자다. 바네사에게 어머니의 왕관을 씌워 주고, 연회장에서는 아이비 편을 들려는 웨슬리를 막아선다. "웨슬리 대공! 이건 우리 남부 용족 왕실의 일입니다." 유료에서는 진실을 안 뒤, 아이비의 누명을 벗기려고 남북 용족 앞에서 자기가 씌워 준 어머니의 왕관을 바네사 머리에서 벗긴다.</w:t>
+        <w:t>남부 용족 둘째 왕자다. 바네사에게 어머니의 왕관을 씌워 주고, 연회장에서는 아이비 편을 들려는 웨슬리를 막아선다. "웨슬리 대공! 이건 우리 남부 용족 왕실의 일입니다." 유료에서는 바네사가 도미닉까지 죽인 걸 안 뒤, 남북 용족 앞에서 자기가 씌워 준 어머니의 왕관을 바네사 머리에서 벗긴다.</w:t>
       </w:r>
     </w:p>
     <w:p>
@@ -882,7 +882,7 @@
           <w:color w:val="1A1A1A"/>
           <w:sz w:val="22"/>
         </w:rPr>
-        <w:t>남부 용족 셋째 왕자다. 바네사에게 "오늘 누구든 널 기분 나쁘게 하면, 내가 지하 감옥에 처넣을 거야."라고 약속하고, 연회장에서 아이비의 오금을 걷어차 무릎 꿇리고 과일 쪽으로 내리누른다. 유료에서는 삼 형제 중 가장 먼저 진실을 알고도 바네사를 동생으로 감싸지만, 반지는 아이비에게 돌려줘야 한다고 했다가 바네사가 먹인 독에 숨진다.</w:t>
+        <w:t>남부 용족 셋째 왕자다. 바네사에게 "오늘 누구든 널 기분 나쁘게 하면, 내가 지하 감옥에 처넣을 거야."라고 약속하고, 연회장에서 아이비의 오금을 걷어차 무릎 꿇리고 과일 쪽으로 내리누른다. 유료에서는 진실을 알고도 바네사를 동생으로 감싸지만, 반지만은 아이비에게 돌려주라고 했다가 바네사가 먹인 독에 숨진다.</w:t>
       </w:r>
     </w:p>
     <w:p>
@@ -957,7 +957,7 @@
           <w:color w:val="1A1A1A"/>
           <w:sz w:val="22"/>
         </w:rPr>
-        <w:t>그날 밤 바네사와 사라의 말을 엿들은 도미닉이 삼 형제 중 처음으로 진실을 안다. 도미닉은 그래도 바네사에게 넌 여전히 내 동생이라고 하면서도, 반지는 아이비에게 돌려줘야 한다고 말한다. 바네사는 다른 오빠들이 알기 전에 도미닉에게 독을 먹이고, 그 죽음을 아이비에게 뒤집어씌운다. 동생 도미닉을 잃은 에드워드와 세바스찬은 아이비를 쫓고, 숲에 몰린 아이비는 웨슬리 품에서 처음 온전한 흰 용이 된다. 두 오빠는 그 모습에서 어머니 엘레노어를 보고서야 진실을 안다. 바네사가 그래도 여왕 자리에 오르려 하자, 세바스찬은 아이비의 누명을 벗기려고 남북 용족 앞에서 자기가 씌워 준 왕관을 바네사 머리에서 벗긴다. 몰래 흑룡의 힘을 빌려 둔 바네사가 불길을 뿜자, 날개를 뜯었던 에드워드가 이번엔 그 불길을 아이비 대신 맞아 제 날개를 잃는다. 아이비는 바네사가 훔쳐 간 힘을 도로 뜯어내고, 쇠사슬을 채워 용 사육장으로 보낸다. 어머니 엘레노어의 반지를 끼고 여왕이 된 아이비는, 날개와 체면을 내놓은 두 오빠를 처음으로 "오빠"라고 부르며 일으켜 세운다. 아이비는 웨슬리와 맺어진다.</w:t>
+        <w:t>바네사는 웨슬리와 아이비가 오빠들을 죽이려 했다며 군사를 보낸다. 숲에 몰린 아이비가 웨슬리 품에서 처음 온전한 흰 용이 되고, 뒤쫓던 오빠들은 그 모습에서 어머니 엘레노어를 보고 진실을 안다. 오빠들은 후회하지만, 스무 해를 동생으로 키운 바네사를 미워하지 못한다. 바네사도 처음엔 아무것도 몰랐기 때문이다. 하지만 바네사는 자기를 감싸면서도 반지만은 아이비에게 돌려주라는 도미닉에게 독을 먹인다. 도미닉까지 죽인 게 바네사라는 걸 알고서야 에드워드와 세바스찬은 바네사에게 등을 돌리지만, 이미 늦었다. 흑룡의 힘을 빌린 바네사가 여왕 자리에 오르려 하자, 세바스찬은 남북 용족 앞에서 자기가 씌워 준 왕관을 바네사 머리에서 벗긴다. 바네사가 불길을 뿜자, 날개를 뜯었던 에드워드가 그 불길을 아이비 대신 맞아 제 날개를 잃는다. 아이비는 바네사가 훔쳐 간 힘을 도로 뜯어내고, 쇠사슬을 채워 용 사육장으로 보낸다. 어머니 엘레노어의 반지를 끼고 여왕이 된 아이비는, 날개와 체면을 내놓은 두 오빠를 처음으로 "오빠"라고 부르며 일으켜 세운다. 아이비는 웨슬리와 맺어진다.</w:t>
       </w:r>
     </w:p>
     <w:p>

</xml_diff>